<commit_message>
Cuan handoff: Shane meets Pat Friday, immediate IP action after
Co-Authored-By: Claude Sonnet 5.5 <noreply@anthropic.com>
Claude-Session: https://claude.ai/code/session_018tEPDD6j3nP1364iYUHcxC
</commit_message>
<xml_diff>
--- a/cuan/Cuan_Handoff_Noesis_2026-10-21.docx
+++ b/cuan/Cuan_Handoff_Noesis_2026-10-21.docx
@@ -165,7 +165,7 @@
         <w:rPr>
           <w:rFonts w:ascii="Calibri" w:cs="Calibri" w:eastAsia="Calibri" w:hAnsi="Calibri"/>
         </w:rPr>
-        <w:t xml:space="preserve">Source of the call content: John dictated it, partly cut off, covering about 95% of the call. The earlier part of the call is not captured. Transcription errors in the dictation: "Oasis" or "Noasis" means Noesis, "San Silvio" means Sancelvio, "Tearshock" means Tairseach, "Kuhn" means Cuan, "Carol" means Pat Carroll, the accountant in Limerick.</w:t>
+        <w:t xml:space="preserve">Source of the call content: John dictated it, partly cut off, covering about 95% of the call. John's view: the earlier part of the call was repeated as the conversation continued and expanded, so nothing of note is missing. Transcription errors in the dictation: "Oasis" or "Noasis" means Noesis, "San Silvio" means Sancelvio, "Tearshock" means Tairseach, "Kuhn" means Cuan, "Carol" means Pat Carroll, the accountant in Limerick.</w:t>
       </w:r>
     </w:p>
     <w:p>
@@ -430,7 +430,7 @@
               <w:rPr>
                 <w:rFonts w:ascii="Calibri" w:cs="Calibri" w:eastAsia="Calibri" w:hAnsi="Calibri"/>
               </w:rPr>
-              <w:t xml:space="preserve">Accountant, Limerick. His office handles the group's company secretarial work and accounts. Not an IP lawyer. Suggested an IPO of Noesis. In-person meeting with John on Friday 23 October.</w:t>
+              <w:t xml:space="preserve">Accountant, Limerick. His office handles the group's company secretarial work and accounts. Not an IP lawyer. Suggested an IPO of Noesis. Meeting Shane on Friday 23 October (John's 21 October note had described it as John's meeting; John has since confirmed it is Shane's).</w:t>
             </w:r>
           </w:p>
         </w:tc>
@@ -3846,13 +3846,37 @@
           <w:b/>
           <w:bCs/>
         </w:rPr>
-        <w:t xml:space="preserve">Friday with Pat Carroll (accountant):</w:t>
+        <w:t xml:space="preserve">Friday, Shane with Pat Carroll (accountant):</w:t>
       </w:r>
       <w:r>
         <w:rPr>
           <w:rFonts w:ascii="Calibri" w:cs="Calibri" w:eastAsia="Calibri" w:hAnsi="Calibri"/>
         </w:rPr>
         <w:t xml:space="preserve"> share structure, order of steps, valuation and tax on moving shares or IP, CRO records, what Shane told Pat on 17 October (John has not seen it), EIIS eligibility. Not IP drafting, which belongs to the IP solicitor.</w:t>
+      </w:r>
+    </w:p>
+    <w:p>
+      <w:pPr>
+        <w:pStyle w:val="ListParagraph"/>
+        <w:numPr>
+          <w:ilvl w:val="0"/>
+          <w:numId w:val="2"/>
+        </w:numPr>
+        <w:spacing w:after="60"/>
+      </w:pPr>
+      <w:r>
+        <w:rPr>
+          <w:rFonts w:ascii="Calibri" w:cs="Calibri" w:eastAsia="Calibri" w:hAnsi="Calibri"/>
+          <w:b/>
+          <w:bCs/>
+        </w:rPr>
+        <w:t xml:space="preserve">Immediate action after Friday:</w:t>
+      </w:r>
+      <w:r>
+        <w:rPr>
+          <w:rFonts w:ascii="Calibri" w:cs="Calibri" w:eastAsia="Calibri" w:hAnsi="Calibri"/>
+        </w:rPr>
+        <w:t xml:space="preserve"> the IP position needs action straight away, and the IP solicitor consultation must take place. Name the solicitor, send the five-question brief and ask for a short written opinion.</w:t>
       </w:r>
     </w:p>
     <w:p>

</xml_diff>

<commit_message>
Cuan handoff: 23 Oct and 30 Oct meetings
Co-Authored-By: Claude Sonnet 5.5 <noreply@anthropic.com>
Claude-Session: https://claude.ai/code/session_018tEPDD6j3nP1364iYUHcxC
</commit_message>
<xml_diff>
--- a/cuan/Cuan_Handoff_Noesis_2026-10-21.docx
+++ b/cuan/Cuan_Handoff_Noesis_2026-10-21.docx
@@ -430,7 +430,59 @@
               <w:rPr>
                 <w:rFonts w:ascii="Calibri" w:cs="Calibri" w:eastAsia="Calibri" w:hAnsi="Calibri"/>
               </w:rPr>
-              <w:t xml:space="preserve">Accountant, Limerick. His office handles the group's company secretarial work and accounts. Not an IP lawyer. Suggested an IPO of Noesis. Meeting Shane on Friday 23 October (John's 21 October note had described it as John's meeting; John has since confirmed it is Shane's).</w:t>
+              <w:t xml:space="preserve">Accountant, Limerick. His office handles the group's company secretarial work and accounts. Not an IP lawyer. Suggested an IPO of Noesis. Hosts the Friday 30 October meeting at his office (section 12).</w:t>
+            </w:r>
+          </w:p>
+        </w:tc>
+      </w:tr>
+      <w:tr>
+        <w:tc>
+          <w:tcPr>
+            <w:tcW w:type="dxa" w:w="2300"/>
+            <w:tcBorders>
+              <w:top w:val="single" w:color="BBBBBB" w:sz="4"/>
+              <w:left w:val="single" w:color="BBBBBB" w:sz="4"/>
+              <w:bottom w:val="single" w:color="BBBBBB" w:sz="4"/>
+              <w:right w:val="single" w:color="BBBBBB" w:sz="4"/>
+            </w:tcBorders>
+            <w:tcMar>
+              <w:top w:type="dxa" w:w="60"/>
+              <w:left w:type="dxa" w:w="100"/>
+              <w:bottom w:type="dxa" w:w="60"/>
+              <w:right w:type="dxa" w:w="100"/>
+            </w:tcMar>
+          </w:tcPr>
+          <w:p>
+            <w:r>
+              <w:rPr>
+                <w:rFonts w:ascii="Calibri" w:cs="Calibri" w:eastAsia="Calibri" w:hAnsi="Calibri"/>
+              </w:rPr>
+              <w:t xml:space="preserve">Tom Stapleton</w:t>
+            </w:r>
+          </w:p>
+        </w:tc>
+        <w:tc>
+          <w:tcPr>
+            <w:tcW w:type="dxa" w:w="7060"/>
+            <w:tcBorders>
+              <w:top w:val="single" w:color="BBBBBB" w:sz="4"/>
+              <w:left w:val="single" w:color="BBBBBB" w:sz="4"/>
+              <w:bottom w:val="single" w:color="BBBBBB" w:sz="4"/>
+              <w:right w:val="single" w:color="BBBBBB" w:sz="4"/>
+            </w:tcBorders>
+            <w:tcMar>
+              <w:top w:type="dxa" w:w="60"/>
+              <w:left w:type="dxa" w:w="100"/>
+              <w:bottom w:type="dxa" w:w="60"/>
+              <w:right w:type="dxa" w:w="100"/>
+            </w:tcMar>
+          </w:tcPr>
+          <w:p>
+            <w:r>
+              <w:rPr>
+                <w:rFonts w:ascii="Calibri" w:cs="Calibri" w:eastAsia="Calibri" w:hAnsi="Calibri"/>
+              </w:rPr>
+              <w:t xml:space="preserve">Attending the 30 October meeting. His role is not recorded in the knowledge base; John to confirm.</w:t>
             </w:r>
           </w:p>
         </w:tc>
@@ -3846,13 +3898,13 @@
           <w:b/>
           <w:bCs/>
         </w:rPr>
-        <w:t xml:space="preserve">Friday, Shane with Pat Carroll (accountant):</w:t>
-      </w:r>
-      <w:r>
-        <w:rPr>
-          <w:rFonts w:ascii="Calibri" w:cs="Calibri" w:eastAsia="Calibri" w:hAnsi="Calibri"/>
-        </w:rPr>
-        <w:t xml:space="preserve"> share structure, order of steps, valuation and tax on moving shares or IP, CRO records, what Shane told Pat on 17 October (John has not seen it), EIIS eligibility. Not IP drafting, which belongs to the IP solicitor.</w:t>
+        <w:t xml:space="preserve">Friday 23 October: Shane and Pat Carroll, three hours, John not attending.</w:t>
+      </w:r>
+      <w:r>
+        <w:rPr>
+          <w:rFonts w:ascii="Calibri" w:cs="Calibri" w:eastAsia="Calibri" w:hAnsi="Calibri"/>
+        </w:rPr>
+        <w:t xml:space="preserve"> Focus: the shareholdings and Shane's family, to resolve that. It is sensitive and personal to Shane. Meridian holds no content from it and none should be inferred. The outcome will probably settle who holds what in Noesis, which affects the cap table, John's 1% and every model in this document, so treat the shareholding figures as provisional until John is told the result.</w:t>
       </w:r>
     </w:p>
     <w:p>
@@ -3870,13 +3922,37 @@
           <w:b/>
           <w:bCs/>
         </w:rPr>
-        <w:t xml:space="preserve">Immediate action after Friday:</w:t>
-      </w:r>
-      <w:r>
-        <w:rPr>
-          <w:rFonts w:ascii="Calibri" w:cs="Calibri" w:eastAsia="Calibri" w:hAnsi="Calibri"/>
-        </w:rPr>
-        <w:t xml:space="preserve"> the IP position needs action straight away, and the IP solicitor consultation must take place. Name the solicitor, send the five-question brief and ask for a short written opinion.</w:t>
+        <w:t xml:space="preserve">Friday 30 October (Friday week): three hours at Pat Carroll's office. Attendees: Pat Carroll, Shane McCarthy, Tom Stapleton and John.</w:t>
+      </w:r>
+      <w:r>
+        <w:rPr>
+          <w:rFonts w:ascii="Calibri" w:cs="Calibri" w:eastAsia="Calibri" w:hAnsi="Calibri"/>
+        </w:rPr>
+        <w:t xml:space="preserve"> Purpose: address all matters and leave with a clear understanding of the way forward and what has to be done. Suggested agenda, in order: (1) the outcome of the 23 October shareholding discussion; (2) who owns ODIN today and the IP plan, with the IP solicitor's advice if obtained; (3) share structure (Noesis holds the companies, Shane at least 76% of Noesis) and tax on moving shares, with a three-round cap table model; (4) the Asterial term sheet position: engine or organism, field, exit clause, costs, counterparty verification; (5) key person and continuity; (6) EIIS for Tairseach, if still live; (7) CRO and filing discrepancies and records for diligence; (8) who does what by when, with dates.</w:t>
+      </w:r>
+    </w:p>
+    <w:p>
+      <w:pPr>
+        <w:pStyle w:val="ListParagraph"/>
+        <w:numPr>
+          <w:ilvl w:val="0"/>
+          <w:numId w:val="2"/>
+        </w:numPr>
+        <w:spacing w:after="60"/>
+      </w:pPr>
+      <w:r>
+        <w:rPr>
+          <w:rFonts w:ascii="Calibri" w:cs="Calibri" w:eastAsia="Calibri" w:hAnsi="Calibri"/>
+          <w:b/>
+          <w:bCs/>
+        </w:rPr>
+        <w:t xml:space="preserve">Immediate action:</w:t>
+      </w:r>
+      <w:r>
+        <w:rPr>
+          <w:rFonts w:ascii="Calibri" w:cs="Calibri" w:eastAsia="Calibri" w:hAnsi="Calibri"/>
+        </w:rPr>
+        <w:t xml:space="preserve"> the IP solicitor consultation must take place and, ideally, before the 30 October meeting so its advice can be tabled. Name the solicitor, send the five-question brief and ask for a short written opinion. Do not wait for the 30 October meeting to start this.</w:t>
       </w:r>
     </w:p>
     <w:p>

</xml_diff>